<commit_message>
added get set methods to Employee.cs
</commit_message>
<xml_diff>
--- a/C#_Project_EPMS_25-04-2026/C#_EPMS_25-04-2026_Assignment.docx
+++ b/C#_Project_EPMS_25-04-2026/C#_EPMS_25-04-2026_Assignment.docx
@@ -447,6 +447,12 @@
           <w:szCs w:val="28"/>
         </w:rPr>
         <w:tab/>
+      </w:r>
+      <w:r>
+        <w:rPr>
+          <w:sz w:val="28"/>
+          <w:szCs w:val="28"/>
+        </w:rPr>
         <w:t xml:space="preserve">Best case – </w:t>
       </w:r>
       <w:proofErr w:type="gramStart"/>
@@ -522,6 +528,12 @@
           <w:szCs w:val="28"/>
         </w:rPr>
         <w:tab/>
+      </w:r>
+      <w:r>
+        <w:rPr>
+          <w:sz w:val="28"/>
+          <w:szCs w:val="28"/>
+        </w:rPr>
         <w:t>Pivot choice when list is already sorted.</w:t>
       </w:r>
     </w:p>
@@ -871,13 +883,155 @@
       </w:pPr>
     </w:p>
     <w:sectPr>
-      <w:pgSz w:w="11906" w:h="16838"/>
+      <w:pgSz w:w="11906" w:h="16838" w:orient="portrait"/>
       <w:pgMar w:top="1440" w:right="1440" w:bottom="1440" w:left="1440" w:header="708" w:footer="708" w:gutter="0"/>
       <w:cols w:space="708"/>
       <w:docGrid w:linePitch="360"/>
+      <w:headerReference w:type="default" r:id="Rbe6fe58a97bc4b5d"/>
+      <w:footerReference w:type="default" r:id="Ra960b893cdbe4dad"/>
     </w:sectPr>
   </w:body>
 </w:document>
+</file>
+
+<file path=word/footer.xml><?xml version="1.0" encoding="utf-8"?>
+<w:ftr xmlns:w14="http://schemas.microsoft.com/office/word/2010/wordml" xmlns:w="http://schemas.openxmlformats.org/wordprocessingml/2006/main">
+  <w:tbl>
+    <w:tblPr>
+      <w:tblStyle w:val="TableNormal"/>
+      <w:bidiVisual w:val="0"/>
+      <w:tblW w:w="0" w:type="auto"/>
+      <w:tblLook w:val="06A0" w:firstRow="1" w:lastRow="0" w:firstColumn="1" w:lastColumn="0" w:noHBand="1" w:noVBand="1"/>
+    </w:tblPr>
+    <w:tblGrid>
+      <w:gridCol w:w="3005"/>
+      <w:gridCol w:w="3005"/>
+      <w:gridCol w:w="3005"/>
+    </w:tblGrid>
+    <w:tr>
+      <w:trPr>
+        <w:trHeight w:val="300"/>
+      </w:trPr>
+      <w:tc>
+        <w:tcPr>
+          <w:tcW w:w="3005" w:type="dxa"/>
+          <w:tcMar/>
+        </w:tcPr>
+        <w:p>
+          <w:pPr>
+            <w:pStyle w:val="Header"/>
+            <w:bidi w:val="0"/>
+            <w:ind w:left="-115"/>
+            <w:jc w:val="left"/>
+          </w:pPr>
+        </w:p>
+      </w:tc>
+      <w:tc>
+        <w:tcPr>
+          <w:tcW w:w="3005" w:type="dxa"/>
+          <w:tcMar/>
+        </w:tcPr>
+        <w:p>
+          <w:pPr>
+            <w:pStyle w:val="Header"/>
+            <w:bidi w:val="0"/>
+            <w:jc w:val="center"/>
+          </w:pPr>
+        </w:p>
+      </w:tc>
+      <w:tc>
+        <w:tcPr>
+          <w:tcW w:w="3005" w:type="dxa"/>
+          <w:tcMar/>
+        </w:tcPr>
+        <w:p>
+          <w:pPr>
+            <w:pStyle w:val="Header"/>
+            <w:bidi w:val="0"/>
+            <w:ind w:right="-115"/>
+            <w:jc w:val="right"/>
+          </w:pPr>
+        </w:p>
+      </w:tc>
+    </w:tr>
+  </w:tbl>
+  <w:p>
+    <w:pPr>
+      <w:pStyle w:val="Footer"/>
+      <w:bidi w:val="0"/>
+    </w:pPr>
+  </w:p>
+</w:ftr>
+</file>
+
+<file path=word/header.xml><?xml version="1.0" encoding="utf-8"?>
+<w:hdr xmlns:w14="http://schemas.microsoft.com/office/word/2010/wordml" xmlns:w="http://schemas.openxmlformats.org/wordprocessingml/2006/main">
+  <w:tbl>
+    <w:tblPr>
+      <w:tblStyle w:val="TableNormal"/>
+      <w:bidiVisual w:val="0"/>
+      <w:tblW w:w="0" w:type="auto"/>
+      <w:tblLook w:val="06A0" w:firstRow="1" w:lastRow="0" w:firstColumn="1" w:lastColumn="0" w:noHBand="1" w:noVBand="1"/>
+    </w:tblPr>
+    <w:tblGrid>
+      <w:gridCol w:w="3005"/>
+      <w:gridCol w:w="3005"/>
+      <w:gridCol w:w="3005"/>
+    </w:tblGrid>
+    <w:tr>
+      <w:trPr>
+        <w:trHeight w:val="300"/>
+      </w:trPr>
+      <w:tc>
+        <w:tcPr>
+          <w:tcW w:w="3005" w:type="dxa"/>
+          <w:tcMar/>
+        </w:tcPr>
+        <w:p>
+          <w:pPr>
+            <w:pStyle w:val="Header"/>
+            <w:bidi w:val="0"/>
+            <w:ind w:left="-115"/>
+            <w:jc w:val="left"/>
+          </w:pPr>
+        </w:p>
+      </w:tc>
+      <w:tc>
+        <w:tcPr>
+          <w:tcW w:w="3005" w:type="dxa"/>
+          <w:tcMar/>
+        </w:tcPr>
+        <w:p>
+          <w:pPr>
+            <w:pStyle w:val="Header"/>
+            <w:bidi w:val="0"/>
+            <w:jc w:val="center"/>
+          </w:pPr>
+        </w:p>
+      </w:tc>
+      <w:tc>
+        <w:tcPr>
+          <w:tcW w:w="3005" w:type="dxa"/>
+          <w:tcMar/>
+        </w:tcPr>
+        <w:p>
+          <w:pPr>
+            <w:pStyle w:val="Header"/>
+            <w:bidi w:val="0"/>
+            <w:ind w:right="-115"/>
+            <w:jc w:val="right"/>
+          </w:pPr>
+        </w:p>
+      </w:tc>
+    </w:tr>
+  </w:tbl>
+  <w:p>
+    <w:pPr>
+      <w:pStyle w:val="Header"/>
+      <w:bidi w:val="0"/>
+    </w:pPr>
+  </w:p>
+</w:hdr>
 </file>
 
 <file path=word/numbering.xml><?xml version="1.0" encoding="utf-8"?>
@@ -894,7 +1048,7 @@
         <w:ind w:left="720" w:hanging="360"/>
       </w:pPr>
       <w:rPr>
-        <w:rFonts w:ascii="Aptos" w:eastAsiaTheme="minorHAnsi" w:hAnsi="Aptos" w:cstheme="minorBidi" w:hint="default"/>
+        <w:rFonts w:hint="default" w:ascii="Aptos" w:hAnsi="Aptos" w:eastAsiaTheme="minorHAnsi" w:cstheme="minorBidi"/>
       </w:rPr>
     </w:lvl>
     <w:lvl w:ilvl="1" w:tplc="40090003" w:tentative="1">
@@ -906,7 +1060,7 @@
         <w:ind w:left="1440" w:hanging="360"/>
       </w:pPr>
       <w:rPr>
-        <w:rFonts w:ascii="Courier New" w:hAnsi="Courier New" w:cs="Courier New" w:hint="default"/>
+        <w:rFonts w:hint="default" w:ascii="Courier New" w:hAnsi="Courier New" w:cs="Courier New"/>
       </w:rPr>
     </w:lvl>
     <w:lvl w:ilvl="2" w:tplc="40090005" w:tentative="1">
@@ -918,7 +1072,7 @@
         <w:ind w:left="2160" w:hanging="360"/>
       </w:pPr>
       <w:rPr>
-        <w:rFonts w:ascii="Wingdings" w:hAnsi="Wingdings" w:hint="default"/>
+        <w:rFonts w:hint="default" w:ascii="Wingdings" w:hAnsi="Wingdings"/>
       </w:rPr>
     </w:lvl>
     <w:lvl w:ilvl="3" w:tplc="40090001" w:tentative="1">
@@ -930,7 +1084,7 @@
         <w:ind w:left="2880" w:hanging="360"/>
       </w:pPr>
       <w:rPr>
-        <w:rFonts w:ascii="Symbol" w:hAnsi="Symbol" w:hint="default"/>
+        <w:rFonts w:hint="default" w:ascii="Symbol" w:hAnsi="Symbol"/>
       </w:rPr>
     </w:lvl>
     <w:lvl w:ilvl="4" w:tplc="40090003" w:tentative="1">
@@ -942,7 +1096,7 @@
         <w:ind w:left="3600" w:hanging="360"/>
       </w:pPr>
       <w:rPr>
-        <w:rFonts w:ascii="Courier New" w:hAnsi="Courier New" w:cs="Courier New" w:hint="default"/>
+        <w:rFonts w:hint="default" w:ascii="Courier New" w:hAnsi="Courier New" w:cs="Courier New"/>
       </w:rPr>
     </w:lvl>
     <w:lvl w:ilvl="5" w:tplc="40090005" w:tentative="1">
@@ -954,7 +1108,7 @@
         <w:ind w:left="4320" w:hanging="360"/>
       </w:pPr>
       <w:rPr>
-        <w:rFonts w:ascii="Wingdings" w:hAnsi="Wingdings" w:hint="default"/>
+        <w:rFonts w:hint="default" w:ascii="Wingdings" w:hAnsi="Wingdings"/>
       </w:rPr>
     </w:lvl>
     <w:lvl w:ilvl="6" w:tplc="40090001" w:tentative="1">
@@ -966,7 +1120,7 @@
         <w:ind w:left="5040" w:hanging="360"/>
       </w:pPr>
       <w:rPr>
-        <w:rFonts w:ascii="Symbol" w:hAnsi="Symbol" w:hint="default"/>
+        <w:rFonts w:hint="default" w:ascii="Symbol" w:hAnsi="Symbol"/>
       </w:rPr>
     </w:lvl>
     <w:lvl w:ilvl="7" w:tplc="40090003" w:tentative="1">
@@ -978,7 +1132,7 @@
         <w:ind w:left="5760" w:hanging="360"/>
       </w:pPr>
       <w:rPr>
-        <w:rFonts w:ascii="Courier New" w:hAnsi="Courier New" w:cs="Courier New" w:hint="default"/>
+        <w:rFonts w:hint="default" w:ascii="Courier New" w:hAnsi="Courier New" w:cs="Courier New"/>
       </w:rPr>
     </w:lvl>
     <w:lvl w:ilvl="8" w:tplc="40090005" w:tentative="1">
@@ -990,7 +1144,7 @@
         <w:ind w:left="6480" w:hanging="360"/>
       </w:pPr>
       <w:rPr>
-        <w:rFonts w:ascii="Wingdings" w:hAnsi="Wingdings" w:hint="default"/>
+        <w:rFonts w:hint="default" w:ascii="Wingdings" w:hAnsi="Wingdings"/>
       </w:rPr>
     </w:lvl>
   </w:abstractNum>
@@ -1010,7 +1164,7 @@
         <w:ind w:left="720" w:hanging="360"/>
       </w:pPr>
       <w:rPr>
-        <w:rFonts w:ascii="Symbol" w:hAnsi="Symbol" w:hint="default"/>
+        <w:rFonts w:hint="default" w:ascii="Symbol" w:hAnsi="Symbol"/>
         <w:sz w:val="20"/>
       </w:rPr>
     </w:lvl>
@@ -1026,7 +1180,7 @@
         <w:ind w:left="1440" w:hanging="360"/>
       </w:pPr>
       <w:rPr>
-        <w:rFonts w:ascii="Courier New" w:hAnsi="Courier New" w:hint="default"/>
+        <w:rFonts w:hint="default" w:ascii="Courier New" w:hAnsi="Courier New"/>
         <w:sz w:val="20"/>
       </w:rPr>
     </w:lvl>
@@ -1042,7 +1196,7 @@
         <w:ind w:left="2160" w:hanging="360"/>
       </w:pPr>
       <w:rPr>
-        <w:rFonts w:ascii="Wingdings" w:hAnsi="Wingdings" w:hint="default"/>
+        <w:rFonts w:hint="default" w:ascii="Wingdings" w:hAnsi="Wingdings"/>
         <w:sz w:val="20"/>
       </w:rPr>
     </w:lvl>
@@ -1058,7 +1212,7 @@
         <w:ind w:left="2880" w:hanging="360"/>
       </w:pPr>
       <w:rPr>
-        <w:rFonts w:ascii="Wingdings" w:hAnsi="Wingdings" w:hint="default"/>
+        <w:rFonts w:hint="default" w:ascii="Wingdings" w:hAnsi="Wingdings"/>
         <w:sz w:val="20"/>
       </w:rPr>
     </w:lvl>
@@ -1074,7 +1228,7 @@
         <w:ind w:left="3600" w:hanging="360"/>
       </w:pPr>
       <w:rPr>
-        <w:rFonts w:ascii="Wingdings" w:hAnsi="Wingdings" w:hint="default"/>
+        <w:rFonts w:hint="default" w:ascii="Wingdings" w:hAnsi="Wingdings"/>
         <w:sz w:val="20"/>
       </w:rPr>
     </w:lvl>
@@ -1090,7 +1244,7 @@
         <w:ind w:left="4320" w:hanging="360"/>
       </w:pPr>
       <w:rPr>
-        <w:rFonts w:ascii="Wingdings" w:hAnsi="Wingdings" w:hint="default"/>
+        <w:rFonts w:hint="default" w:ascii="Wingdings" w:hAnsi="Wingdings"/>
         <w:sz w:val="20"/>
       </w:rPr>
     </w:lvl>
@@ -1106,7 +1260,7 @@
         <w:ind w:left="5040" w:hanging="360"/>
       </w:pPr>
       <w:rPr>
-        <w:rFonts w:ascii="Wingdings" w:hAnsi="Wingdings" w:hint="default"/>
+        <w:rFonts w:hint="default" w:ascii="Wingdings" w:hAnsi="Wingdings"/>
         <w:sz w:val="20"/>
       </w:rPr>
     </w:lvl>
@@ -1122,7 +1276,7 @@
         <w:ind w:left="5760" w:hanging="360"/>
       </w:pPr>
       <w:rPr>
-        <w:rFonts w:ascii="Wingdings" w:hAnsi="Wingdings" w:hint="default"/>
+        <w:rFonts w:hint="default" w:ascii="Wingdings" w:hAnsi="Wingdings"/>
         <w:sz w:val="20"/>
       </w:rPr>
     </w:lvl>
@@ -1138,7 +1292,7 @@
         <w:ind w:left="6480" w:hanging="360"/>
       </w:pPr>
       <w:rPr>
-        <w:rFonts w:ascii="Wingdings" w:hAnsi="Wingdings" w:hint="default"/>
+        <w:rFonts w:hint="default" w:ascii="Wingdings" w:hAnsi="Wingdings"/>
         <w:sz w:val="20"/>
       </w:rPr>
     </w:lvl>
@@ -1153,11 +1307,11 @@
 </file>
 
 <file path=word/styles.xml><?xml version="1.0" encoding="utf-8"?>
-<w:styles xmlns:mc="http://schemas.openxmlformats.org/markup-compatibility/2006" xmlns:r="http://schemas.openxmlformats.org/officeDocument/2006/relationships" xmlns:w="http://schemas.openxmlformats.org/wordprocessingml/2006/main" xmlns:w14="http://schemas.microsoft.com/office/word/2010/wordml" xmlns:w15="http://schemas.microsoft.com/office/word/2012/wordml" xmlns:w16cex="http://schemas.microsoft.com/office/word/2018/wordml/cex" xmlns:w16cid="http://schemas.microsoft.com/office/word/2016/wordml/cid" xmlns:w16="http://schemas.microsoft.com/office/word/2018/wordml" xmlns:w16du="http://schemas.microsoft.com/office/word/2023/wordml/word16du" xmlns:w16sdtdh="http://schemas.microsoft.com/office/word/2020/wordml/sdtdatahash" xmlns:w16sdtfl="http://schemas.microsoft.com/office/word/2024/wordml/sdtformatlock" xmlns:w16se="http://schemas.microsoft.com/office/word/2015/wordml/symex" mc:Ignorable="w14 w15 w16se w16cid w16 w16cex w16sdtdh w16sdtfl w16du">
+<w:styles xmlns:wp14="http://schemas.microsoft.com/office/word/2010/wordprocessingDrawing" xmlns:mc="http://schemas.openxmlformats.org/markup-compatibility/2006" xmlns:r="http://schemas.openxmlformats.org/officeDocument/2006/relationships" xmlns:w="http://schemas.openxmlformats.org/wordprocessingml/2006/main" xmlns:w14="http://schemas.microsoft.com/office/word/2010/wordml" xmlns:w15="http://schemas.microsoft.com/office/word/2012/wordml" xmlns:w16cex="http://schemas.microsoft.com/office/word/2018/wordml/cex" xmlns:w16cid="http://schemas.microsoft.com/office/word/2016/wordml/cid" xmlns:w16="http://schemas.microsoft.com/office/word/2018/wordml" xmlns:w16du="http://schemas.microsoft.com/office/word/2023/wordml/word16du" xmlns:w16sdtdh="http://schemas.microsoft.com/office/word/2020/wordml/sdtdatahash" xmlns:w16sdtfl="http://schemas.microsoft.com/office/word/2024/wordml/sdtformatlock" xmlns:w16se="http://schemas.microsoft.com/office/word/2015/wordml/symex" mc:Ignorable="w14 w15 w16se w16cid w16 w16cex w16sdtdh w16sdtfl w16du wp14">
   <w:docDefaults>
     <w:rPrDefault>
       <w:rPr>
-        <w:rFonts w:asciiTheme="minorHAnsi" w:eastAsiaTheme="minorHAnsi" w:hAnsiTheme="minorHAnsi" w:cstheme="minorBidi"/>
+        <w:rFonts w:asciiTheme="minorHAnsi" w:hAnsiTheme="minorHAnsi" w:eastAsiaTheme="minorHAnsi" w:cstheme="minorBidi"/>
         <w:kern w:val="2"/>
         <w:sz w:val="24"/>
         <w:szCs w:val="24"/>
@@ -1174,14 +1328,14 @@
   <w:latentStyles w:defLockedState="0" w:defUIPriority="99" w:defSemiHidden="0" w:defUnhideWhenUsed="0" w:defQFormat="0" w:count="376">
     <w:lsdException w:name="Normal" w:uiPriority="0" w:qFormat="1"/>
     <w:lsdException w:name="heading 1" w:uiPriority="9" w:qFormat="1"/>
-    <w:lsdException w:name="heading 2" w:semiHidden="1" w:uiPriority="9" w:unhideWhenUsed="1" w:qFormat="1"/>
-    <w:lsdException w:name="heading 3" w:semiHidden="1" w:uiPriority="9" w:unhideWhenUsed="1" w:qFormat="1"/>
-    <w:lsdException w:name="heading 4" w:semiHidden="1" w:uiPriority="9" w:unhideWhenUsed="1" w:qFormat="1"/>
-    <w:lsdException w:name="heading 5" w:semiHidden="1" w:uiPriority="9" w:unhideWhenUsed="1" w:qFormat="1"/>
-    <w:lsdException w:name="heading 6" w:semiHidden="1" w:uiPriority="9" w:unhideWhenUsed="1" w:qFormat="1"/>
-    <w:lsdException w:name="heading 7" w:semiHidden="1" w:uiPriority="9" w:unhideWhenUsed="1" w:qFormat="1"/>
-    <w:lsdException w:name="heading 8" w:semiHidden="1" w:uiPriority="9" w:unhideWhenUsed="1" w:qFormat="1"/>
-    <w:lsdException w:name="heading 9" w:semiHidden="1" w:uiPriority="9" w:unhideWhenUsed="1" w:qFormat="1"/>
+    <w:lsdException w:name="heading 2" w:uiPriority="9" w:semiHidden="1" w:unhideWhenUsed="1" w:qFormat="1"/>
+    <w:lsdException w:name="heading 3" w:uiPriority="9" w:semiHidden="1" w:unhideWhenUsed="1" w:qFormat="1"/>
+    <w:lsdException w:name="heading 4" w:uiPriority="9" w:semiHidden="1" w:unhideWhenUsed="1" w:qFormat="1"/>
+    <w:lsdException w:name="heading 5" w:uiPriority="9" w:semiHidden="1" w:unhideWhenUsed="1" w:qFormat="1"/>
+    <w:lsdException w:name="heading 6" w:uiPriority="9" w:semiHidden="1" w:unhideWhenUsed="1" w:qFormat="1"/>
+    <w:lsdException w:name="heading 7" w:uiPriority="9" w:semiHidden="1" w:unhideWhenUsed="1" w:qFormat="1"/>
+    <w:lsdException w:name="heading 8" w:uiPriority="9" w:semiHidden="1" w:unhideWhenUsed="1" w:qFormat="1"/>
+    <w:lsdException w:name="heading 9" w:uiPriority="9" w:semiHidden="1" w:unhideWhenUsed="1" w:qFormat="1"/>
     <w:lsdException w:name="index 1" w:semiHidden="1" w:unhideWhenUsed="1"/>
     <w:lsdException w:name="index 2" w:semiHidden="1" w:unhideWhenUsed="1"/>
     <w:lsdException w:name="index 3" w:semiHidden="1" w:unhideWhenUsed="1"/>
@@ -1191,22 +1345,22 @@
     <w:lsdException w:name="index 7" w:semiHidden="1" w:unhideWhenUsed="1"/>
     <w:lsdException w:name="index 8" w:semiHidden="1" w:unhideWhenUsed="1"/>
     <w:lsdException w:name="index 9" w:semiHidden="1" w:unhideWhenUsed="1"/>
-    <w:lsdException w:name="toc 1" w:semiHidden="1" w:uiPriority="39" w:unhideWhenUsed="1"/>
-    <w:lsdException w:name="toc 2" w:semiHidden="1" w:uiPriority="39" w:unhideWhenUsed="1"/>
-    <w:lsdException w:name="toc 3" w:semiHidden="1" w:uiPriority="39" w:unhideWhenUsed="1"/>
-    <w:lsdException w:name="toc 4" w:semiHidden="1" w:uiPriority="39" w:unhideWhenUsed="1"/>
-    <w:lsdException w:name="toc 5" w:semiHidden="1" w:uiPriority="39" w:unhideWhenUsed="1"/>
-    <w:lsdException w:name="toc 6" w:semiHidden="1" w:uiPriority="39" w:unhideWhenUsed="1"/>
-    <w:lsdException w:name="toc 7" w:semiHidden="1" w:uiPriority="39" w:unhideWhenUsed="1"/>
-    <w:lsdException w:name="toc 8" w:semiHidden="1" w:uiPriority="39" w:unhideWhenUsed="1"/>
-    <w:lsdException w:name="toc 9" w:semiHidden="1" w:uiPriority="39" w:unhideWhenUsed="1"/>
+    <w:lsdException w:name="toc 1" w:uiPriority="39" w:semiHidden="1" w:unhideWhenUsed="1"/>
+    <w:lsdException w:name="toc 2" w:uiPriority="39" w:semiHidden="1" w:unhideWhenUsed="1"/>
+    <w:lsdException w:name="toc 3" w:uiPriority="39" w:semiHidden="1" w:unhideWhenUsed="1"/>
+    <w:lsdException w:name="toc 4" w:uiPriority="39" w:semiHidden="1" w:unhideWhenUsed="1"/>
+    <w:lsdException w:name="toc 5" w:uiPriority="39" w:semiHidden="1" w:unhideWhenUsed="1"/>
+    <w:lsdException w:name="toc 6" w:uiPriority="39" w:semiHidden="1" w:unhideWhenUsed="1"/>
+    <w:lsdException w:name="toc 7" w:uiPriority="39" w:semiHidden="1" w:unhideWhenUsed="1"/>
+    <w:lsdException w:name="toc 8" w:uiPriority="39" w:semiHidden="1" w:unhideWhenUsed="1"/>
+    <w:lsdException w:name="toc 9" w:uiPriority="39" w:semiHidden="1" w:unhideWhenUsed="1"/>
     <w:lsdException w:name="Normal Indent" w:semiHidden="1" w:unhideWhenUsed="1"/>
     <w:lsdException w:name="footnote text" w:semiHidden="1" w:unhideWhenUsed="1"/>
     <w:lsdException w:name="annotation text" w:semiHidden="1" w:unhideWhenUsed="1"/>
     <w:lsdException w:name="header" w:semiHidden="1" w:unhideWhenUsed="1"/>
     <w:lsdException w:name="footer" w:semiHidden="1" w:unhideWhenUsed="1"/>
     <w:lsdException w:name="index heading" w:semiHidden="1" w:unhideWhenUsed="1"/>
-    <w:lsdException w:name="caption" w:semiHidden="1" w:uiPriority="35" w:unhideWhenUsed="1" w:qFormat="1"/>
+    <w:lsdException w:name="caption" w:uiPriority="35" w:semiHidden="1" w:unhideWhenUsed="1" w:qFormat="1"/>
     <w:lsdException w:name="table of figures" w:semiHidden="1" w:unhideWhenUsed="1"/>
     <w:lsdException w:name="envelope address" w:semiHidden="1" w:unhideWhenUsed="1"/>
     <w:lsdException w:name="envelope return" w:semiHidden="1" w:unhideWhenUsed="1"/>
@@ -1237,7 +1391,7 @@
     <w:lsdException w:name="Title" w:uiPriority="10" w:qFormat="1"/>
     <w:lsdException w:name="Closing" w:semiHidden="1" w:unhideWhenUsed="1"/>
     <w:lsdException w:name="Signature" w:semiHidden="1" w:unhideWhenUsed="1"/>
-    <w:lsdException w:name="Default Paragraph Font" w:semiHidden="1" w:uiPriority="1" w:unhideWhenUsed="1"/>
+    <w:lsdException w:name="Default Paragraph Font" w:uiPriority="1" w:semiHidden="1" w:unhideWhenUsed="1"/>
     <w:lsdException w:name="Body Text" w:semiHidden="1" w:unhideWhenUsed="1"/>
     <w:lsdException w:name="Body Text Indent" w:semiHidden="1" w:unhideWhenUsed="1"/>
     <w:lsdException w:name="List Continue" w:semiHidden="1" w:unhideWhenUsed="1"/>
@@ -1437,8 +1591,8 @@
     <w:lsdException w:name="Subtle Reference" w:uiPriority="31" w:qFormat="1"/>
     <w:lsdException w:name="Intense Reference" w:uiPriority="32" w:qFormat="1"/>
     <w:lsdException w:name="Book Title" w:uiPriority="33" w:qFormat="1"/>
-    <w:lsdException w:name="Bibliography" w:semiHidden="1" w:uiPriority="37" w:unhideWhenUsed="1"/>
-    <w:lsdException w:name="TOC Heading" w:semiHidden="1" w:uiPriority="39" w:unhideWhenUsed="1" w:qFormat="1"/>
+    <w:lsdException w:name="Bibliography" w:uiPriority="37" w:semiHidden="1" w:unhideWhenUsed="1"/>
+    <w:lsdException w:name="TOC Heading" w:uiPriority="39" w:semiHidden="1" w:unhideWhenUsed="1" w:qFormat="1"/>
     <w:lsdException w:name="Plain Table 1" w:uiPriority="41"/>
     <w:lsdException w:name="Plain Table 2" w:uiPriority="42"/>
     <w:lsdException w:name="Plain Table 3" w:uiPriority="43"/>
@@ -1549,7 +1703,7 @@
     <w:lsdException w:name="Unresolved Mention" w:semiHidden="1" w:unhideWhenUsed="1"/>
     <w:lsdException w:name="Smart Link" w:semiHidden="1" w:unhideWhenUsed="1"/>
   </w:latentStyles>
-  <w:style w:type="paragraph" w:default="1" w:styleId="Normal">
+  <w:style w:type="paragraph" w:styleId="Normal" w:default="1">
     <w:name w:val="Normal"/>
     <w:qFormat/>
   </w:style>
@@ -1568,7 +1722,7 @@
       <w:outlineLvl w:val="0"/>
     </w:pPr>
     <w:rPr>
-      <w:rFonts w:asciiTheme="majorHAnsi" w:eastAsiaTheme="majorEastAsia" w:hAnsiTheme="majorHAnsi" w:cstheme="majorBidi"/>
+      <w:rFonts w:asciiTheme="majorHAnsi" w:hAnsiTheme="majorHAnsi" w:eastAsiaTheme="majorEastAsia" w:cstheme="majorBidi"/>
       <w:color w:val="0F4761" w:themeColor="accent1" w:themeShade="BF"/>
       <w:sz w:val="40"/>
       <w:szCs w:val="40"/>
@@ -1591,7 +1745,7 @@
       <w:outlineLvl w:val="1"/>
     </w:pPr>
     <w:rPr>
-      <w:rFonts w:asciiTheme="majorHAnsi" w:eastAsiaTheme="majorEastAsia" w:hAnsiTheme="majorHAnsi" w:cstheme="majorBidi"/>
+      <w:rFonts w:asciiTheme="majorHAnsi" w:hAnsiTheme="majorHAnsi" w:eastAsiaTheme="majorEastAsia" w:cstheme="majorBidi"/>
       <w:color w:val="0F4761" w:themeColor="accent1" w:themeShade="BF"/>
       <w:sz w:val="32"/>
       <w:szCs w:val="32"/>
@@ -1752,12 +1906,12 @@
       <w:color w:val="272727" w:themeColor="text1" w:themeTint="D8"/>
     </w:rPr>
   </w:style>
-  <w:style w:type="character" w:default="1" w:styleId="DefaultParagraphFont">
+  <w:style w:type="character" w:styleId="DefaultParagraphFont" w:default="1">
     <w:name w:val="Default Paragraph Font"/>
     <w:uiPriority w:val="1"/>
     <w:unhideWhenUsed/>
   </w:style>
-  <w:style w:type="table" w:default="1" w:styleId="TableNormal">
+  <w:style w:type="table" w:styleId="TableNormal" w:default="1">
     <w:name w:val="Normal Table"/>
     <w:uiPriority w:val="99"/>
     <w:semiHidden/>
@@ -1772,26 +1926,26 @@
       </w:tblCellMar>
     </w:tblPr>
   </w:style>
-  <w:style w:type="numbering" w:default="1" w:styleId="NoList">
+  <w:style w:type="numbering" w:styleId="NoList" w:default="1">
     <w:name w:val="No List"/>
     <w:uiPriority w:val="99"/>
     <w:semiHidden/>
     <w:unhideWhenUsed/>
   </w:style>
-  <w:style w:type="character" w:customStyle="1" w:styleId="Heading1Char">
+  <w:style w:type="character" w:styleId="Heading1Char" w:customStyle="1">
     <w:name w:val="Heading 1 Char"/>
     <w:basedOn w:val="DefaultParagraphFont"/>
     <w:link w:val="Heading1"/>
     <w:uiPriority w:val="9"/>
     <w:rsid w:val="00A37B7F"/>
     <w:rPr>
-      <w:rFonts w:asciiTheme="majorHAnsi" w:eastAsiaTheme="majorEastAsia" w:hAnsiTheme="majorHAnsi" w:cstheme="majorBidi"/>
+      <w:rFonts w:asciiTheme="majorHAnsi" w:hAnsiTheme="majorHAnsi" w:eastAsiaTheme="majorEastAsia" w:cstheme="majorBidi"/>
       <w:color w:val="0F4761" w:themeColor="accent1" w:themeShade="BF"/>
       <w:sz w:val="40"/>
       <w:szCs w:val="40"/>
     </w:rPr>
   </w:style>
-  <w:style w:type="character" w:customStyle="1" w:styleId="Heading2Char">
+  <w:style w:type="character" w:styleId="Heading2Char" w:customStyle="1">
     <w:name w:val="Heading 2 Char"/>
     <w:basedOn w:val="DefaultParagraphFont"/>
     <w:link w:val="Heading2"/>
@@ -1799,13 +1953,13 @@
     <w:semiHidden/>
     <w:rsid w:val="00A37B7F"/>
     <w:rPr>
-      <w:rFonts w:asciiTheme="majorHAnsi" w:eastAsiaTheme="majorEastAsia" w:hAnsiTheme="majorHAnsi" w:cstheme="majorBidi"/>
+      <w:rFonts w:asciiTheme="majorHAnsi" w:hAnsiTheme="majorHAnsi" w:eastAsiaTheme="majorEastAsia" w:cstheme="majorBidi"/>
       <w:color w:val="0F4761" w:themeColor="accent1" w:themeShade="BF"/>
       <w:sz w:val="32"/>
       <w:szCs w:val="32"/>
     </w:rPr>
   </w:style>
-  <w:style w:type="character" w:customStyle="1" w:styleId="Heading3Char">
+  <w:style w:type="character" w:styleId="Heading3Char" w:customStyle="1">
     <w:name w:val="Heading 3 Char"/>
     <w:basedOn w:val="DefaultParagraphFont"/>
     <w:link w:val="Heading3"/>
@@ -1819,7 +1973,7 @@
       <w:szCs w:val="28"/>
     </w:rPr>
   </w:style>
-  <w:style w:type="character" w:customStyle="1" w:styleId="Heading4Char">
+  <w:style w:type="character" w:styleId="Heading4Char" w:customStyle="1">
     <w:name w:val="Heading 4 Char"/>
     <w:basedOn w:val="DefaultParagraphFont"/>
     <w:link w:val="Heading4"/>
@@ -1833,7 +1987,7 @@
       <w:color w:val="0F4761" w:themeColor="accent1" w:themeShade="BF"/>
     </w:rPr>
   </w:style>
-  <w:style w:type="character" w:customStyle="1" w:styleId="Heading5Char">
+  <w:style w:type="character" w:styleId="Heading5Char" w:customStyle="1">
     <w:name w:val="Heading 5 Char"/>
     <w:basedOn w:val="DefaultParagraphFont"/>
     <w:link w:val="Heading5"/>
@@ -1845,7 +1999,7 @@
       <w:color w:val="0F4761" w:themeColor="accent1" w:themeShade="BF"/>
     </w:rPr>
   </w:style>
-  <w:style w:type="character" w:customStyle="1" w:styleId="Heading6Char">
+  <w:style w:type="character" w:styleId="Heading6Char" w:customStyle="1">
     <w:name w:val="Heading 6 Char"/>
     <w:basedOn w:val="DefaultParagraphFont"/>
     <w:link w:val="Heading6"/>
@@ -1859,7 +2013,7 @@
       <w:color w:val="595959" w:themeColor="text1" w:themeTint="A6"/>
     </w:rPr>
   </w:style>
-  <w:style w:type="character" w:customStyle="1" w:styleId="Heading7Char">
+  <w:style w:type="character" w:styleId="Heading7Char" w:customStyle="1">
     <w:name w:val="Heading 7 Char"/>
     <w:basedOn w:val="DefaultParagraphFont"/>
     <w:link w:val="Heading7"/>
@@ -1871,7 +2025,7 @@
       <w:color w:val="595959" w:themeColor="text1" w:themeTint="A6"/>
     </w:rPr>
   </w:style>
-  <w:style w:type="character" w:customStyle="1" w:styleId="Heading8Char">
+  <w:style w:type="character" w:styleId="Heading8Char" w:customStyle="1">
     <w:name w:val="Heading 8 Char"/>
     <w:basedOn w:val="DefaultParagraphFont"/>
     <w:link w:val="Heading8"/>
@@ -1885,7 +2039,7 @@
       <w:color w:val="272727" w:themeColor="text1" w:themeTint="D8"/>
     </w:rPr>
   </w:style>
-  <w:style w:type="character" w:customStyle="1" w:styleId="Heading9Char">
+  <w:style w:type="character" w:styleId="Heading9Char" w:customStyle="1">
     <w:name w:val="Heading 9 Char"/>
     <w:basedOn w:val="DefaultParagraphFont"/>
     <w:link w:val="Heading9"/>
@@ -1910,21 +2064,21 @@
       <w:contextualSpacing/>
     </w:pPr>
     <w:rPr>
-      <w:rFonts w:asciiTheme="majorHAnsi" w:eastAsiaTheme="majorEastAsia" w:hAnsiTheme="majorHAnsi" w:cstheme="majorBidi"/>
+      <w:rFonts w:asciiTheme="majorHAnsi" w:hAnsiTheme="majorHAnsi" w:eastAsiaTheme="majorEastAsia" w:cstheme="majorBidi"/>
       <w:spacing w:val="-10"/>
       <w:kern w:val="28"/>
       <w:sz w:val="56"/>
       <w:szCs w:val="56"/>
     </w:rPr>
   </w:style>
-  <w:style w:type="character" w:customStyle="1" w:styleId="TitleChar">
+  <w:style w:type="character" w:styleId="TitleChar" w:customStyle="1">
     <w:name w:val="Title Char"/>
     <w:basedOn w:val="DefaultParagraphFont"/>
     <w:link w:val="Title"/>
     <w:uiPriority w:val="10"/>
     <w:rsid w:val="00A37B7F"/>
     <w:rPr>
-      <w:rFonts w:asciiTheme="majorHAnsi" w:eastAsiaTheme="majorEastAsia" w:hAnsiTheme="majorHAnsi" w:cstheme="majorBidi"/>
+      <w:rFonts w:asciiTheme="majorHAnsi" w:hAnsiTheme="majorHAnsi" w:eastAsiaTheme="majorEastAsia" w:cstheme="majorBidi"/>
       <w:spacing w:val="-10"/>
       <w:kern w:val="28"/>
       <w:sz w:val="56"/>
@@ -1952,7 +2106,7 @@
       <w:szCs w:val="28"/>
     </w:rPr>
   </w:style>
-  <w:style w:type="character" w:customStyle="1" w:styleId="SubtitleChar">
+  <w:style w:type="character" w:styleId="SubtitleChar" w:customStyle="1">
     <w:name w:val="Subtitle Char"/>
     <w:basedOn w:val="DefaultParagraphFont"/>
     <w:link w:val="Subtitle"/>
@@ -1984,7 +2138,7 @@
       <w:color w:val="404040" w:themeColor="text1" w:themeTint="BF"/>
     </w:rPr>
   </w:style>
-  <w:style w:type="character" w:customStyle="1" w:styleId="QuoteChar">
+  <w:style w:type="character" w:styleId="QuoteChar" w:customStyle="1">
     <w:name w:val="Quote Char"/>
     <w:basedOn w:val="DefaultParagraphFont"/>
     <w:link w:val="Quote"/>
@@ -2029,8 +2183,8 @@
     <w:rsid w:val="00A37B7F"/>
     <w:pPr>
       <w:pBdr>
-        <w:top w:val="single" w:sz="4" w:space="10" w:color="0F4761" w:themeColor="accent1" w:themeShade="BF"/>
-        <w:bottom w:val="single" w:sz="4" w:space="10" w:color="0F4761" w:themeColor="accent1" w:themeShade="BF"/>
+        <w:top w:val="single" w:color="0F4761" w:themeColor="accent1" w:themeShade="BF" w:sz="4" w:space="10"/>
+        <w:bottom w:val="single" w:color="0F4761" w:themeColor="accent1" w:themeShade="BF" w:sz="4" w:space="10"/>
       </w:pBdr>
       <w:spacing w:before="360" w:after="360"/>
       <w:ind w:left="864" w:right="864"/>
@@ -2042,7 +2196,7 @@
       <w:color w:val="0F4761" w:themeColor="accent1" w:themeShade="BF"/>
     </w:rPr>
   </w:style>
-  <w:style w:type="character" w:customStyle="1" w:styleId="IntenseQuoteChar">
+  <w:style w:type="character" w:styleId="IntenseQuoteChar" w:customStyle="1">
     <w:name w:val="Intense Quote Char"/>
     <w:basedOn w:val="DefaultParagraphFont"/>
     <w:link w:val="IntenseQuote"/>
@@ -2068,11 +2222,65 @@
       <w:spacing w:val="5"/>
     </w:rPr>
   </w:style>
+  <w:style w:type="paragraph" w:styleId="Header">
+    <w:uiPriority w:val="99"/>
+    <w:name w:val="header"/>
+    <w:basedOn w:val="Normal"/>
+    <w:unhideWhenUsed/>
+    <w:rsid w:val="3A0B9797"/>
+    <w:pPr>
+      <w:tabs>
+        <w:tab w:val="center" w:leader="none" w:pos="4680"/>
+        <w:tab w:val="right" w:leader="none" w:pos="9360"/>
+      </w:tabs>
+      <w:spacing w:after="0" w:line="240" w:lineRule="auto"/>
+    </w:pPr>
+  </w:style>
+  <w:style w:type="paragraph" w:styleId="Footer">
+    <w:uiPriority w:val="99"/>
+    <w:name w:val="footer"/>
+    <w:basedOn w:val="Normal"/>
+    <w:unhideWhenUsed/>
+    <w:rsid w:val="3A0B9797"/>
+    <w:pPr>
+      <w:tabs>
+        <w:tab w:val="center" w:leader="none" w:pos="4680"/>
+        <w:tab w:val="right" w:leader="none" w:pos="9360"/>
+      </w:tabs>
+      <w:spacing w:after="0" w:line="240" w:lineRule="auto"/>
+    </w:pPr>
+  </w:style>
+  <w:style xmlns:w="http://schemas.openxmlformats.org/wordprocessingml/2006/main" w:type="table" w:styleId="TableGrid">
+    <w:name xmlns:w="http://schemas.openxmlformats.org/wordprocessingml/2006/main" w:val="Table Grid"/>
+    <w:basedOn xmlns:w="http://schemas.openxmlformats.org/wordprocessingml/2006/main" w:val="TableNormal"/>
+    <w:uiPriority xmlns:w="http://schemas.openxmlformats.org/wordprocessingml/2006/main" w:val="59"/>
+    <w:rsid xmlns:w="http://schemas.openxmlformats.org/wordprocessingml/2006/main" w:val="00FB4123"/>
+    <w:pPr xmlns:w="http://schemas.openxmlformats.org/wordprocessingml/2006/main">
+      <w:spacing w:after="0" w:line="240" w:lineRule="auto"/>
+    </w:pPr>
+    <w:tblPr xmlns:w="http://schemas.openxmlformats.org/wordprocessingml/2006/main">
+      <w:tblInd w:w="0" w:type="dxa"/>
+      <w:tblBorders>
+        <w:top w:val="single" w:color="000000" w:themeColor="text1" w:sz="4" w:space="0"/>
+        <w:left w:val="single" w:color="000000" w:themeColor="text1" w:sz="4" w:space="0"/>
+        <w:bottom w:val="single" w:color="000000" w:themeColor="text1" w:sz="4" w:space="0"/>
+        <w:right w:val="single" w:color="000000" w:themeColor="text1" w:sz="4" w:space="0"/>
+        <w:insideH w:val="single" w:color="000000" w:themeColor="text1" w:sz="4" w:space="0"/>
+        <w:insideV w:val="single" w:color="000000" w:themeColor="text1" w:sz="4" w:space="0"/>
+      </w:tblBorders>
+      <w:tblCellMar>
+        <w:top w:w="0" w:type="dxa"/>
+        <w:left w:w="108" w:type="dxa"/>
+        <w:bottom w:w="0" w:type="dxa"/>
+        <w:right w:w="108" w:type="dxa"/>
+      </w:tblCellMar>
+    </w:tblPr>
+  </w:style>
 </w:styles>
 </file>
 
 <file path=word/theme/theme1.xml><?xml version="1.0" encoding="utf-8"?>
-<a:theme xmlns:a="http://schemas.openxmlformats.org/drawingml/2006/main" name="Office Theme">
+<a:theme xmlns:a="http://schemas.openxmlformats.org/drawingml/2006/main" xmlns:thm15="http://schemas.microsoft.com/office/thememl/2012/main" name="Office Theme">
   <a:themeElements>
     <a:clrScheme name="Office">
       <a:dk1>

</xml_diff>